<commit_message>
Direktstart und Aktenoptik verbessern
</commit_message>
<xml_diff>
--- a/testakten/arbeitsrecht-kuendigungsdrama-koerber-werk/01_erstgespraech_mandantennotiz.docx
+++ b/testakten/arbeitsrecht-kuendigungsdrama-koerber-werk/01_erstgespraech_mandantennotiz.docx
@@ -5,16 +5,20 @@
     <w:p>
       <w:pPr>
         <w:pStyle w:val="Heading1"/>
+        <w:spacing w:after="160" w:line="259" w:lineRule="auto"/>
       </w:pPr>
       <w:r>
         <w:rPr>
           <w:rFonts w:ascii="Times New Roman" w:hAnsi="Times New Roman"/>
+          <w:b/>
+          <w:sz w:val="28"/>
         </w:rPr>
         <w:t>Kanzleinotiz – Erstgespräch 30.05.2025</w:t>
       </w:r>
     </w:p>
     <w:p>
       <w:pPr>
+        <w:spacing w:line="259" w:lineRule="auto" w:after="60"/>
         <w:jc w:val="left"/>
       </w:pPr>
       <w:r>
@@ -23,46 +27,82 @@
     </w:p>
     <w:p>
       <w:pPr>
+        <w:spacing w:before="120" w:after="60" w:line="259" w:lineRule="auto"/>
         <w:jc w:val="left"/>
       </w:pPr>
       <w:r>
+        <w:rPr>
+          <w:rFonts w:ascii="Times New Roman" w:hAnsi="Times New Roman"/>
+          <w:b w:val="0"/>
+          <w:i w:val="0"/>
+          <w:sz w:val="22"/>
+        </w:rPr>
         <w:t>Aktenzeichen (intern): KLK/2025/0530-ARB-KOE</w:t>
       </w:r>
     </w:p>
     <w:p>
       <w:pPr>
+        <w:spacing w:before="120" w:after="60" w:line="259" w:lineRule="auto"/>
         <w:jc w:val="left"/>
       </w:pPr>
       <w:r>
+        <w:rPr>
+          <w:rFonts w:ascii="Times New Roman" w:hAnsi="Times New Roman"/>
+          <w:b w:val="0"/>
+          <w:i w:val="0"/>
+          <w:sz w:val="22"/>
+        </w:rPr>
         <w:t>Datum: 30.05.2025, 10:15 Uhr</w:t>
       </w:r>
     </w:p>
     <w:p>
       <w:pPr>
+        <w:spacing w:before="120" w:after="60" w:line="259" w:lineRule="auto"/>
         <w:jc w:val="left"/>
       </w:pPr>
       <w:r>
+        <w:rPr>
+          <w:rFonts w:ascii="Times New Roman" w:hAnsi="Times New Roman"/>
+          <w:b w:val="0"/>
+          <w:i w:val="0"/>
+          <w:sz w:val="22"/>
+        </w:rPr>
         <w:t>Dauer: ca. 105 Minuten</w:t>
       </w:r>
     </w:p>
     <w:p>
       <w:pPr>
+        <w:spacing w:before="120" w:after="60" w:line="259" w:lineRule="auto"/>
         <w:jc w:val="left"/>
       </w:pPr>
       <w:r>
+        <w:rPr>
+          <w:rFonts w:ascii="Times New Roman" w:hAnsi="Times New Roman"/>
+          <w:b w:val="0"/>
+          <w:i w:val="0"/>
+          <w:sz w:val="22"/>
+        </w:rPr>
         <w:t>Bearbeiter: RA Dr. Jonas Reuß, Fachanwalt für Arbeitsrecht</w:t>
       </w:r>
     </w:p>
     <w:p>
       <w:pPr>
+        <w:spacing w:before="120" w:after="60" w:line="259" w:lineRule="auto"/>
         <w:jc w:val="left"/>
       </w:pPr>
       <w:r>
+        <w:rPr>
+          <w:rFonts w:ascii="Times New Roman" w:hAnsi="Times New Roman"/>
+          <w:b w:val="0"/>
+          <w:i w:val="0"/>
+          <w:sz w:val="22"/>
+        </w:rPr>
         <w:t>Mandantin: Dr. Annika Körber, Forstweg 14, 16225 Eberswalde, geb. 12.03.1978</w:t>
       </w:r>
     </w:p>
     <w:p>
       <w:pPr>
+        <w:spacing w:line="259" w:lineRule="auto" w:after="60"/>
         <w:jc w:val="left"/>
       </w:pPr>
       <w:r>
@@ -71,16 +111,28 @@
     </w:p>
     <w:p>
       <w:pPr>
+        <w:spacing w:line="259" w:lineRule="auto" w:after="60"/>
         <w:jc w:val="left"/>
       </w:pPr>
       <w:r>
+        <w:rPr>
+          <w:rFonts w:ascii="Times New Roman" w:hAnsi="Times New Roman"/>
+          <w:b w:val="0"/>
+          <w:i w:val="0"/>
+          <w:sz w:val="22"/>
+        </w:rPr>
         <w:t>Vollmacht: Heute unterzeichnet, Original liegt bei Akte</w:t>
       </w:r>
     </w:p>
-    <w:p/>
+    <w:p>
+      <w:pPr>
+        <w:spacing w:line="259" w:lineRule="auto" w:after="60"/>
+      </w:pPr>
+    </w:p>
     <w:p>
       <w:pPr>
         <w:pStyle w:val="Heading2"/>
+        <w:spacing w:line="259" w:lineRule="auto" w:after="60"/>
       </w:pPr>
       <w:r>
         <w:rPr>
@@ -91,6 +143,7 @@
     </w:p>
     <w:p>
       <w:pPr>
+        <w:spacing w:line="259" w:lineRule="auto" w:after="60"/>
         <w:jc w:val="left"/>
       </w:pPr>
       <w:r>
@@ -99,16 +152,22 @@
     </w:p>
     <w:p>
       <w:pPr>
+        <w:spacing w:line="259" w:lineRule="auto" w:after="60"/>
         <w:jc w:val="left"/>
       </w:pPr>
       <w:r>
         <w:t>Familäre Situation: verheiratet, zwei Kinder (14 und 9 Jahre), Ehemann Tobias Körber ist Selbständiger im Bereich Softwareentwicklung (schwankende Einkünfte). Eigentümer der Immobilie in Eberswalde.</w:t>
       </w:r>
     </w:p>
-    <w:p/>
+    <w:p>
+      <w:pPr>
+        <w:spacing w:line="259" w:lineRule="auto" w:after="60"/>
+      </w:pPr>
+    </w:p>
     <w:p>
       <w:pPr>
         <w:pStyle w:val="Heading2"/>
+        <w:spacing w:line="259" w:lineRule="auto" w:after="60"/>
       </w:pPr>
       <w:r>
         <w:rPr>
@@ -120,6 +179,7 @@
     <w:p>
       <w:pPr>
         <w:pStyle w:val="Heading3"/>
+        <w:spacing w:line="259" w:lineRule="auto" w:after="60"/>
       </w:pPr>
       <w:r>
         <w:rPr>
@@ -130,6 +190,7 @@
     </w:p>
     <w:p>
       <w:pPr>
+        <w:spacing w:line="259" w:lineRule="auto" w:after="60"/>
         <w:jc w:val="left"/>
       </w:pPr>
       <w:r>
@@ -138,6 +199,7 @@
     </w:p>
     <w:p>
       <w:pPr>
+        <w:spacing w:line="259" w:lineRule="auto" w:after="60"/>
         <w:jc w:val="left"/>
       </w:pPr>
       <w:r>
@@ -147,6 +209,7 @@
     <w:p>
       <w:pPr>
         <w:pStyle w:val="Heading3"/>
+        <w:spacing w:line="259" w:lineRule="auto" w:after="60"/>
       </w:pPr>
       <w:r>
         <w:rPr>
@@ -157,6 +220,7 @@
     </w:p>
     <w:p>
       <w:pPr>
+        <w:spacing w:line="259" w:lineRule="auto" w:after="60"/>
         <w:jc w:val="left"/>
       </w:pPr>
       <w:r>
@@ -165,6 +229,7 @@
     </w:p>
     <w:p>
       <w:pPr>
+        <w:spacing w:line="259" w:lineRule="auto" w:after="60"/>
         <w:jc w:val="left"/>
       </w:pPr>
       <w:r>
@@ -174,6 +239,7 @@
     <w:p>
       <w:pPr>
         <w:pStyle w:val="Heading3"/>
+        <w:spacing w:line="259" w:lineRule="auto" w:after="60"/>
       </w:pPr>
       <w:r>
         <w:rPr>
@@ -184,6 +250,7 @@
     </w:p>
     <w:p>
       <w:pPr>
+        <w:spacing w:line="259" w:lineRule="auto" w:after="60"/>
         <w:jc w:val="left"/>
       </w:pPr>
       <w:r>
@@ -193,6 +260,7 @@
     <w:p>
       <w:pPr>
         <w:pStyle w:val="Heading3"/>
+        <w:spacing w:line="259" w:lineRule="auto" w:after="60"/>
       </w:pPr>
       <w:r>
         <w:rPr>
@@ -203,6 +271,7 @@
     </w:p>
     <w:p>
       <w:pPr>
+        <w:spacing w:line="259" w:lineRule="auto" w:after="60"/>
         <w:jc w:val="left"/>
       </w:pPr>
       <w:r>
@@ -211,6 +280,7 @@
     </w:p>
     <w:p>
       <w:pPr>
+        <w:spacing w:line="259" w:lineRule="auto" w:after="60"/>
         <w:jc w:val="left"/>
       </w:pPr>
       <w:r>
@@ -219,6 +289,7 @@
     </w:p>
     <w:p>
       <w:pPr>
+        <w:spacing w:line="259" w:lineRule="auto" w:after="60"/>
         <w:jc w:val="left"/>
       </w:pPr>
       <w:r>
@@ -228,6 +299,7 @@
     <w:p>
       <w:pPr>
         <w:pStyle w:val="Heading3"/>
+        <w:spacing w:line="259" w:lineRule="auto" w:after="60"/>
       </w:pPr>
       <w:r>
         <w:rPr>
@@ -238,6 +310,7 @@
     </w:p>
     <w:p>
       <w:pPr>
+        <w:spacing w:line="259" w:lineRule="auto" w:after="60"/>
         <w:jc w:val="left"/>
       </w:pPr>
       <w:r>
@@ -246,6 +319,7 @@
     </w:p>
     <w:p>
       <w:pPr>
+        <w:spacing w:line="259" w:lineRule="auto" w:after="60"/>
         <w:jc w:val="left"/>
       </w:pPr>
       <w:r>
@@ -254,16 +328,22 @@
     </w:p>
     <w:p>
       <w:pPr>
+        <w:spacing w:line="259" w:lineRule="auto" w:after="60"/>
         <w:jc w:val="left"/>
       </w:pPr>
       <w:r>
         <w:t>EntgTranspG-Auskunft: Körber hatte am 04.03.2024 über den Betriebsrat (§ 10 Abs. 1 EntgTranspG, da kein Betriebsrat in der Rolle des Auskunftspflichtigen) beim HR-Leiter die Vergleichsgehälter angefordert. Antwort kam erst am 14.06.2024, inhaltlich ausweichend.</w:t>
       </w:r>
     </w:p>
-    <w:p/>
+    <w:p>
+      <w:pPr>
+        <w:spacing w:line="259" w:lineRule="auto" w:after="60"/>
+      </w:pPr>
+    </w:p>
     <w:p>
       <w:pPr>
         <w:pStyle w:val="Heading2"/>
+        <w:spacing w:line="259" w:lineRule="auto" w:after="60"/>
       </w:pPr>
       <w:r>
         <w:rPr>
@@ -869,10 +949,15 @@
         </w:tc>
       </w:tr>
     </w:tbl>
-    <w:p/>
+    <w:p>
+      <w:pPr>
+        <w:spacing w:line="259" w:lineRule="auto" w:after="60"/>
+      </w:pPr>
+    </w:p>
     <w:p>
       <w:pPr>
         <w:pStyle w:val="Heading2"/>
+        <w:spacing w:line="259" w:lineRule="auto" w:after="60"/>
       </w:pPr>
       <w:r>
         <w:rPr>
@@ -1196,10 +1281,15 @@
         </w:tc>
       </w:tr>
     </w:tbl>
-    <w:p/>
+    <w:p>
+      <w:pPr>
+        <w:spacing w:line="259" w:lineRule="auto" w:after="60"/>
+      </w:pPr>
+    </w:p>
     <w:p>
       <w:pPr>
         <w:pStyle w:val="Heading2"/>
+        <w:spacing w:line="259" w:lineRule="auto" w:after="60"/>
       </w:pPr>
       <w:r>
         <w:rPr>
@@ -1210,6 +1300,7 @@
     </w:p>
     <w:p>
       <w:pPr>
+        <w:spacing w:line="259" w:lineRule="auto" w:after="60"/>
         <w:jc w:val="left"/>
       </w:pPr>
       <w:r>
@@ -1218,6 +1309,7 @@
     </w:p>
     <w:p>
       <w:pPr>
+        <w:spacing w:line="259" w:lineRule="auto" w:after="60"/>
         <w:jc w:val="left"/>
       </w:pPr>
       <w:r>
@@ -1226,6 +1318,7 @@
     </w:p>
     <w:p>
       <w:pPr>
+        <w:spacing w:line="259" w:lineRule="auto" w:after="60"/>
         <w:jc w:val="left"/>
       </w:pPr>
       <w:r>
@@ -1234,6 +1327,7 @@
     </w:p>
     <w:p>
       <w:pPr>
+        <w:spacing w:line="259" w:lineRule="auto" w:after="60"/>
         <w:jc w:val="left"/>
       </w:pPr>
       <w:r>
@@ -1244,13 +1338,58 @@
       </w:r>
     </w:p>
     <w:sectPr>
+      <w:headerReference w:type="default" r:id="rId9"/>
+      <w:footerReference w:type="default" r:id="rId10"/>
       <w:pgSz w:w="11906" w:h="16838"/>
-      <w:pgMar w:top="1417" w:right="1417" w:bottom="1417" w:left="1417" w:header="720" w:footer="720" w:gutter="0"/>
+      <w:pgMar w:top="1191" w:right="1247" w:bottom="1134" w:left="1361" w:header="720" w:footer="720" w:gutter="0"/>
       <w:cols w:space="720"/>
       <w:docGrid w:linePitch="360"/>
     </w:sectPr>
   </w:body>
 </w:document>
+</file>
+
+<file path=word/footer1.xml><?xml version="1.0" encoding="utf-8"?>
+<w:ftr xmlns:m="http://schemas.openxmlformats.org/officeDocument/2006/math" xmlns:mc="http://schemas.openxmlformats.org/markup-compatibility/2006" xmlns:mo="http://schemas.microsoft.com/office/mac/office/2008/main" xmlns:mv="urn:schemas-microsoft-com:mac:vml" xmlns:o="urn:schemas-microsoft-com:office:office" xmlns:r="http://schemas.openxmlformats.org/officeDocument/2006/relationships" xmlns:v="urn:schemas-microsoft-com:vml" xmlns:w10="urn:schemas-microsoft-com:office:word" xmlns:w14="http://schemas.microsoft.com/office/word/2010/wordml" xmlns:w="http://schemas.openxmlformats.org/wordprocessingml/2006/main" xmlns:wne="http://schemas.microsoft.com/office/word/2006/wordml" xmlns:wp14="http://schemas.microsoft.com/office/word/2010/wordprocessingDrawing" xmlns:wp="http://schemas.openxmlformats.org/drawingml/2006/wordprocessingDrawing" xmlns:wpc="http://schemas.microsoft.com/office/word/2010/wordprocessingCanvas" xmlns:wpg="http://schemas.microsoft.com/office/word/2010/wordprocessingGroup" xmlns:wpi="http://schemas.microsoft.com/office/word/2010/wordprocessingInk" xmlns:wps="http://schemas.microsoft.com/office/word/2010/wordprocessingShape" mc:Ignorable="w14 wp14">
+  <w:p>
+    <w:pPr>
+      <w:pStyle w:val="Footer"/>
+      <w:jc w:val="left"/>
+    </w:pPr>
+    <w:r/>
+    <w:r>
+      <w:rPr>
+        <w:rFonts w:ascii="Times New Roman" w:hAnsi="Times New Roman"/>
+        <w:b w:val="0"/>
+        <w:color w:val="777777"/>
+        <w:sz w:val="17"/>
+      </w:rPr>
+      <w:t>Vertraulich | Bearbeitungsstand Juli 2026 | nur zur Aktenbearbeitung</w:t>
+    </w:r>
+  </w:p>
+</w:ftr>
+</file>
+
+<file path=word/header1.xml><?xml version="1.0" encoding="utf-8"?>
+<w:hdr xmlns:m="http://schemas.openxmlformats.org/officeDocument/2006/math" xmlns:mc="http://schemas.openxmlformats.org/markup-compatibility/2006" xmlns:mo="http://schemas.microsoft.com/office/mac/office/2008/main" xmlns:mv="urn:schemas-microsoft-com:mac:vml" xmlns:o="urn:schemas-microsoft-com:office:office" xmlns:r="http://schemas.openxmlformats.org/officeDocument/2006/relationships" xmlns:v="urn:schemas-microsoft-com:vml" xmlns:w10="urn:schemas-microsoft-com:office:word" xmlns:w14="http://schemas.microsoft.com/office/word/2010/wordml" xmlns:w="http://schemas.openxmlformats.org/wordprocessingml/2006/main" xmlns:wne="http://schemas.microsoft.com/office/word/2006/wordml" xmlns:wp14="http://schemas.microsoft.com/office/word/2010/wordprocessingDrawing" xmlns:wp="http://schemas.openxmlformats.org/drawingml/2006/wordprocessingDrawing" xmlns:wpc="http://schemas.microsoft.com/office/word/2010/wordprocessingCanvas" xmlns:wpg="http://schemas.microsoft.com/office/word/2010/wordprocessingGroup" xmlns:wpi="http://schemas.microsoft.com/office/word/2010/wordprocessingInk" xmlns:wps="http://schemas.microsoft.com/office/word/2010/wordprocessingShape" mc:Ignorable="w14 wp14">
+  <w:p>
+    <w:pPr>
+      <w:pStyle w:val="Header"/>
+      <w:jc w:val="left"/>
+    </w:pPr>
+    <w:r/>
+    <w:r>
+      <w:rPr>
+        <w:rFonts w:ascii="Times New Roman" w:hAnsi="Times New Roman"/>
+        <w:b w:val="0"/>
+        <w:i w:val="0"/>
+        <w:color w:val="666666"/>
+        <w:sz w:val="17"/>
+      </w:rPr>
+      <w:t>Klotzkette Rechtsanwaltsgesellschaft mbH | Arbeitsrechtliche Mandatsakte | Bearbeitungsstand Juli 2026</w:t>
+    </w:r>
+  </w:p>
+</w:hdr>
 </file>
 
 <file path=word/numbering.xml><?xml version="1.0" encoding="utf-8"?>
@@ -1967,11 +2106,12 @@
       <w:contextualSpacing/>
     </w:pPr>
     <w:rPr>
-      <w:rFonts w:asciiTheme="majorHAnsi" w:eastAsiaTheme="majorEastAsia" w:hAnsiTheme="majorHAnsi" w:cstheme="majorBidi"/>
+      <w:rFonts w:asciiTheme="majorHAnsi" w:eastAsiaTheme="majorEastAsia" w:hAnsiTheme="majorHAnsi" w:cstheme="majorBidi" w:ascii="Times New Roman" w:hAnsi="Times New Roman"/>
+      <w:b/>
       <w:color w:val="17365D" w:themeColor="text2" w:themeShade="BF"/>
       <w:spacing w:val="5"/>
       <w:kern w:val="28"/>
-      <w:sz w:val="52"/>
+      <w:sz w:val="30"/>
       <w:szCs w:val="52"/>
     </w:rPr>
   </w:style>

</xml_diff>

<commit_message>
v433.0.0: Einzelakten vollständig und layoutgetreu aufbereiten
</commit_message>
<xml_diff>
--- a/testakten/arbeitsrecht-kuendigungsdrama-koerber-werk/01_erstgespraech_mandantennotiz.docx
+++ b/testakten/arbeitsrecht-kuendigungsdrama-koerber-werk/01_erstgespraech_mandantennotiz.docx
@@ -332,7 +332,7 @@
         <w:jc w:val="left"/>
       </w:pPr>
       <w:r>
-        <w:t>EntgTranspG-Auskunft: Körber hatte am 04.03.2024 über den Betriebsrat (§ 10 Abs. 1 EntgTranspG, da kein Betriebsrat in der Rolle des Auskunftspflichtigen) beim HR-Leiter die Vergleichsgehälter angefordert. Antwort kam erst am 14.06.2024, inhaltlich ausweichend.</w:t>
+        <w:t>EntgTranspG-Auskunft: Körber hatte am 04.03.2024 über den Betriebsrat (Paragraf 10 Abs. 1 EntgTranspG, da kein Betriebsrat in der Rolle des Auskunftspflichtigen) beim HR-Leiter die Vergleichsgehälter angefordert. Antwort kam erst am 14.06.2024, inhaltlich ausweichend.</w:t>
       </w:r>
     </w:p>
     <w:p>
@@ -465,7 +465,7 @@
                 <w:rFonts w:ascii="Times New Roman" w:hAnsi="Times New Roman"/>
                 <w:sz w:val="20"/>
               </w:rPr>
-              <w:t>§§ 4, 7 KSchG, § 1 KSchG (personenbedingt), § 17 KSchG (betriebsbedingt)</w:t>
+              <w:t>Paragrafen 4, 7 KSchG, Paragraf 1 KSchG (personenbedingt), Paragraf 17 KSchG (betriebsbedingt)</w:t>
             </w:r>
           </w:p>
         </w:tc>
@@ -523,7 +523,7 @@
                 <w:rFonts w:ascii="Times New Roman" w:hAnsi="Times New Roman"/>
                 <w:sz w:val="20"/>
               </w:rPr>
-              <w:t>§ 167 Abs. 2 SGB IX</w:t>
+              <w:t>Paragraf 167 Abs. 2 SGB IX</w:t>
             </w:r>
           </w:p>
         </w:tc>
@@ -581,7 +581,7 @@
                 <w:rFonts w:ascii="Times New Roman" w:hAnsi="Times New Roman"/>
                 <w:sz w:val="20"/>
               </w:rPr>
-              <w:t>§ 36 HinSchG, § 612a BGB</w:t>
+              <w:t>Paragraf 36 HinSchG, Paragraf 612a BGB</w:t>
             </w:r>
           </w:p>
         </w:tc>
@@ -639,7 +639,7 @@
                 <w:rFonts w:ascii="Times New Roman" w:hAnsi="Times New Roman"/>
                 <w:sz w:val="20"/>
               </w:rPr>
-              <w:t>§§ 3 Abs. 2, 7, 8 EntgTranspG, § 22 AGG</w:t>
+              <w:t>Paragrafen 3 Abs. 2, 7, 8 EntgTranspG, Paragraf 22 AGG</w:t>
             </w:r>
           </w:p>
         </w:tc>
@@ -697,7 +697,7 @@
                 <w:rFonts w:ascii="Times New Roman" w:hAnsi="Times New Roman"/>
                 <w:sz w:val="20"/>
               </w:rPr>
-              <w:t>§§ 14, 16 TzBfG</w:t>
+              <w:t>Paragrafen 14, 16 TzBfG</w:t>
             </w:r>
           </w:p>
         </w:tc>
@@ -755,7 +755,7 @@
                 <w:rFonts w:ascii="Times New Roman" w:hAnsi="Times New Roman"/>
                 <w:sz w:val="20"/>
               </w:rPr>
-              <w:t>§ 7 BUrlG, § 17 KSchG (Abgeltung)</w:t>
+              <w:t>Paragraf 7 BUrlG, Paragraf 17 KSchG (Abgeltung)</w:t>
             </w:r>
           </w:p>
         </w:tc>
@@ -813,7 +813,7 @@
                 <w:rFonts w:ascii="Times New Roman" w:hAnsi="Times New Roman"/>
                 <w:sz w:val="20"/>
               </w:rPr>
-              <w:t>§§ 102, 25 BetrVG</w:t>
+              <w:t>Paragrafen 102, 25 BetrVG</w:t>
             </w:r>
           </w:p>
         </w:tc>
@@ -871,7 +871,7 @@
                 <w:rFonts w:ascii="Times New Roman" w:hAnsi="Times New Roman"/>
                 <w:sz w:val="20"/>
               </w:rPr>
-              <w:t>§ 17 KSchG, RL 98/59/EG</w:t>
+              <w:t>Paragraf 17 KSchG, RL 98/59/EG</w:t>
             </w:r>
           </w:p>
         </w:tc>
@@ -929,7 +929,7 @@
                 <w:rFonts w:ascii="Times New Roman" w:hAnsi="Times New Roman"/>
                 <w:sz w:val="20"/>
               </w:rPr>
-              <w:t>§ 134 BGB, § 138 BGB</w:t>
+              <w:t>Paragraf 134 BGB, Paragraf 138 BGB</w:t>
             </w:r>
           </w:p>
         </w:tc>
@@ -1079,7 +1079,7 @@
                 <w:rFonts w:ascii="Times New Roman" w:hAnsi="Times New Roman"/>
                 <w:sz w:val="20"/>
               </w:rPr>
-              <w:t>§ 4 KSchG</w:t>
+              <w:t>Paragraf 4 KSchG</w:t>
             </w:r>
           </w:p>
         </w:tc>
@@ -1145,7 +1145,7 @@
                 <w:rFonts w:ascii="Times New Roman" w:hAnsi="Times New Roman"/>
                 <w:sz w:val="20"/>
               </w:rPr>
-              <w:t>§ 17 TzBfG</w:t>
+              <w:t>Paragraf 17 TzBfG</w:t>
             </w:r>
           </w:p>
         </w:tc>
@@ -1189,7 +1189,7 @@
                 <w:rFonts w:ascii="Times New Roman" w:hAnsi="Times New Roman"/>
                 <w:sz w:val="20"/>
               </w:rPr>
-              <w:t>keine — Durchsetzung jederzeit möglich (§ 15 AGG 3-Monats-Frist prüfen)</w:t>
+              <w:t>keine — Durchsetzung jederzeit möglich (Paragraf 15 AGG 3-Monats-Frist prüfen)</w:t>
             </w:r>
           </w:p>
         </w:tc>
@@ -1203,7 +1203,7 @@
                 <w:rFonts w:ascii="Times New Roman" w:hAnsi="Times New Roman"/>
                 <w:sz w:val="20"/>
               </w:rPr>
-              <w:t>§ 15 AGG</w:t>
+              <w:t>Paragraf 15 AGG</w:t>
             </w:r>
           </w:p>
         </w:tc>
@@ -1261,7 +1261,7 @@
                 <w:rFonts w:ascii="Times New Roman" w:hAnsi="Times New Roman"/>
                 <w:sz w:val="20"/>
               </w:rPr>
-              <w:t>§ 102 BetrVG</w:t>
+              <w:t>Paragraf 102 BetrVG</w:t>
             </w:r>
           </w:p>
         </w:tc>

</xml_diff>